<commit_message>
melhorias relatorio e nova tabela
</commit_message>
<xml_diff>
--- a/cienciaDados/atv2/relatorio_final.docx
+++ b/cienciaDados/atv2/relatorio_final.docx
@@ -1965,15 +1965,7 @@
       </w:r>
       <w:proofErr w:type="spellEnd"/>
       <w:r>
-        <w:t xml:space="preserve"> (42, 123, 456). O relatório apresenta </w:t>
-      </w:r>
-      <w:proofErr w:type="gramStart"/>
-      <w:r>
-        <w:t>media</w:t>
-      </w:r>
-      <w:proofErr w:type="gramEnd"/>
-      <w:r>
-        <w:t xml:space="preserve"> e desvio padrão.</w:t>
+        <w:t xml:space="preserve"> (42, 123, 456). O relatório apresenta media e desvio padrão.</w:t>
       </w:r>
     </w:p>
     <w:p>
@@ -2056,7 +2048,1069 @@
         <w:pStyle w:val="Ttulo2"/>
       </w:pPr>
       <w:r>
-        <w:t>5.1 Impacto do mecanismo de ausência</w:t>
+        <w:t>5.</w:t>
+      </w:r>
+      <w:r>
+        <w:t>1</w:t>
+      </w:r>
+      <w:r>
+        <w:t xml:space="preserve"> </w:t>
+      </w:r>
+      <w:r>
+        <w:t xml:space="preserve">Comparação geral: baseline × </w:t>
+      </w:r>
+      <w:proofErr w:type="spellStart"/>
+      <w:r>
+        <w:t>dropna</w:t>
+      </w:r>
+      <w:proofErr w:type="spellEnd"/>
+      <w:r>
+        <w:t xml:space="preserve"> × melhor imputador</w:t>
+      </w:r>
+    </w:p>
+    <w:p>
+      <w:pPr>
+        <w:spacing w:before="80" w:after="80"/>
+        <w:jc w:val="both"/>
+      </w:pPr>
+      <w:r>
+        <w:t xml:space="preserve">A </w:t>
+      </w:r>
+      <w:r>
+        <w:t xml:space="preserve">Tabela </w:t>
+      </w:r>
+      <w:r>
+        <w:t xml:space="preserve">abaixo compara os três cenários principais para cada </w:t>
+      </w:r>
+      <w:proofErr w:type="spellStart"/>
+      <w:r>
+        <w:t>dataset</w:t>
+      </w:r>
+      <w:proofErr w:type="spellEnd"/>
+      <w:r>
+        <w:t xml:space="preserve">, usando </w:t>
+      </w:r>
+      <w:proofErr w:type="spellStart"/>
+      <w:r>
+        <w:t>LightGBM</w:t>
+      </w:r>
+      <w:proofErr w:type="spellEnd"/>
+      <w:r>
+        <w:t>:</w:t>
+      </w:r>
+    </w:p>
+    <w:tbl>
+      <w:tblPr>
+        <w:tblpPr w:leftFromText="141" w:rightFromText="141" w:vertAnchor="text" w:tblpY="1"/>
+        <w:tblOverlap w:val="never"/>
+        <w:tblW w:w="9024" w:type="dxa"/>
+        <w:tblBorders>
+          <w:top w:val="single" w:sz="4" w:space="0" w:color="auto"/>
+          <w:left w:val="single" w:sz="4" w:space="0" w:color="auto"/>
+          <w:bottom w:val="single" w:sz="4" w:space="0" w:color="auto"/>
+          <w:right w:val="single" w:sz="4" w:space="0" w:color="auto"/>
+          <w:insideH w:val="single" w:sz="4" w:space="0" w:color="auto"/>
+          <w:insideV w:val="single" w:sz="4" w:space="0" w:color="auto"/>
+        </w:tblBorders>
+        <w:tblCellMar>
+          <w:left w:w="10" w:type="dxa"/>
+          <w:right w:w="10" w:type="dxa"/>
+        </w:tblCellMar>
+        <w:tblLook w:val="0000" w:firstRow="0" w:lastRow="0" w:firstColumn="0" w:lastColumn="0" w:noHBand="0" w:noVBand="0"/>
+      </w:tblPr>
+      <w:tblGrid>
+        <w:gridCol w:w="2276"/>
+        <w:gridCol w:w="1750"/>
+        <w:gridCol w:w="1735"/>
+        <w:gridCol w:w="1791"/>
+        <w:gridCol w:w="1472"/>
+      </w:tblGrid>
+      <w:tr>
+        <w:tc>
+          <w:tcPr>
+            <w:tcW w:w="2276" w:type="dxa"/>
+            <w:tcBorders>
+              <w:top w:val="single" w:sz="1" w:space="0" w:color="2E75B6"/>
+              <w:left w:val="single" w:sz="1" w:space="0" w:color="2E75B6"/>
+              <w:bottom w:val="single" w:sz="1" w:space="0" w:color="2E75B6"/>
+              <w:right w:val="single" w:sz="1" w:space="0" w:color="2E75B6"/>
+            </w:tcBorders>
+            <w:shd w:val="clear" w:color="auto" w:fill="D6E4F0"/>
+            <w:tcMar>
+              <w:top w:w="80" w:type="dxa"/>
+              <w:left w:w="120" w:type="dxa"/>
+              <w:bottom w:w="80" w:type="dxa"/>
+              <w:right w:w="120" w:type="dxa"/>
+            </w:tcMar>
+            <w:vAlign w:val="center"/>
+          </w:tcPr>
+          <w:p>
+            <w:proofErr w:type="spellStart"/>
+            <w:r>
+              <w:rPr>
+                <w:b/>
+                <w:bCs/>
+                <w:sz w:val="20"/>
+                <w:szCs w:val="20"/>
+              </w:rPr>
+              <w:t>Dataset</w:t>
+            </w:r>
+            <w:proofErr w:type="spellEnd"/>
+          </w:p>
+        </w:tc>
+        <w:tc>
+          <w:tcPr>
+            <w:tcW w:w="1750" w:type="dxa"/>
+            <w:tcBorders>
+              <w:top w:val="single" w:sz="1" w:space="0" w:color="2E75B6"/>
+              <w:left w:val="single" w:sz="1" w:space="0" w:color="2E75B6"/>
+              <w:bottom w:val="single" w:sz="1" w:space="0" w:color="2E75B6"/>
+              <w:right w:val="single" w:sz="1" w:space="0" w:color="2E75B6"/>
+            </w:tcBorders>
+            <w:shd w:val="clear" w:color="auto" w:fill="D6E4F0"/>
+            <w:tcMar>
+              <w:top w:w="80" w:type="dxa"/>
+              <w:left w:w="120" w:type="dxa"/>
+              <w:bottom w:w="80" w:type="dxa"/>
+              <w:right w:w="120" w:type="dxa"/>
+            </w:tcMar>
+            <w:vAlign w:val="center"/>
+          </w:tcPr>
+          <w:p>
+            <w:r>
+              <w:rPr>
+                <w:b/>
+                <w:bCs/>
+                <w:sz w:val="20"/>
+                <w:szCs w:val="20"/>
+              </w:rPr>
+              <w:t>Baseline</w:t>
+            </w:r>
+          </w:p>
+        </w:tc>
+        <w:tc>
+          <w:tcPr>
+            <w:tcW w:w="1735" w:type="dxa"/>
+            <w:tcBorders>
+              <w:top w:val="single" w:sz="1" w:space="0" w:color="2E75B6"/>
+              <w:left w:val="single" w:sz="1" w:space="0" w:color="2E75B6"/>
+              <w:bottom w:val="single" w:sz="1" w:space="0" w:color="2E75B6"/>
+              <w:right w:val="single" w:sz="1" w:space="0" w:color="2E75B6"/>
+            </w:tcBorders>
+            <w:shd w:val="clear" w:color="auto" w:fill="D6E4F0"/>
+            <w:tcMar>
+              <w:top w:w="80" w:type="dxa"/>
+              <w:left w:w="120" w:type="dxa"/>
+              <w:bottom w:w="80" w:type="dxa"/>
+              <w:right w:w="120" w:type="dxa"/>
+            </w:tcMar>
+            <w:vAlign w:val="center"/>
+          </w:tcPr>
+          <w:p>
+            <w:proofErr w:type="spellStart"/>
+            <w:r>
+              <w:rPr>
+                <w:b/>
+                <w:bCs/>
+                <w:sz w:val="20"/>
+                <w:szCs w:val="20"/>
+              </w:rPr>
+              <w:t>Dropna</w:t>
+            </w:r>
+            <w:proofErr w:type="spellEnd"/>
+            <w:r>
+              <w:rPr>
+                <w:b/>
+                <w:bCs/>
+                <w:sz w:val="20"/>
+                <w:szCs w:val="20"/>
+              </w:rPr>
+              <w:t xml:space="preserve"> injetado</w:t>
+            </w:r>
+          </w:p>
+        </w:tc>
+        <w:tc>
+          <w:tcPr>
+            <w:tcW w:w="1791" w:type="dxa"/>
+            <w:tcBorders>
+              <w:top w:val="single" w:sz="1" w:space="0" w:color="2E75B6"/>
+              <w:left w:val="single" w:sz="1" w:space="0" w:color="2E75B6"/>
+              <w:bottom w:val="single" w:sz="1" w:space="0" w:color="2E75B6"/>
+              <w:right w:val="single" w:sz="1" w:space="0" w:color="2E75B6"/>
+            </w:tcBorders>
+            <w:shd w:val="clear" w:color="auto" w:fill="D6E4F0"/>
+            <w:tcMar>
+              <w:top w:w="80" w:type="dxa"/>
+              <w:left w:w="120" w:type="dxa"/>
+              <w:bottom w:w="80" w:type="dxa"/>
+              <w:right w:w="120" w:type="dxa"/>
+            </w:tcMar>
+            <w:vAlign w:val="center"/>
+          </w:tcPr>
+          <w:p>
+            <w:r>
+              <w:rPr>
+                <w:b/>
+                <w:bCs/>
+                <w:sz w:val="20"/>
+                <w:szCs w:val="20"/>
+              </w:rPr>
+              <w:t>Melhor imputador</w:t>
+            </w:r>
+          </w:p>
+        </w:tc>
+        <w:tc>
+          <w:tcPr>
+            <w:tcW w:w="1472" w:type="dxa"/>
+            <w:tcBorders>
+              <w:top w:val="single" w:sz="1" w:space="0" w:color="2E75B6"/>
+              <w:left w:val="single" w:sz="1" w:space="0" w:color="2E75B6"/>
+              <w:bottom w:val="single" w:sz="1" w:space="0" w:color="2E75B6"/>
+              <w:right w:val="single" w:sz="1" w:space="0" w:color="2E75B6"/>
+            </w:tcBorders>
+            <w:shd w:val="clear" w:color="auto" w:fill="D6E4F0"/>
+          </w:tcPr>
+          <w:p>
+            <w:pPr>
+              <w:rPr>
+                <w:b/>
+                <w:bCs/>
+                <w:sz w:val="20"/>
+                <w:szCs w:val="20"/>
+              </w:rPr>
+            </w:pPr>
+            <w:r>
+              <w:rPr>
+                <w:b/>
+                <w:bCs/>
+                <w:sz w:val="20"/>
+                <w:szCs w:val="20"/>
+              </w:rPr>
+              <w:t>Valor</w:t>
+            </w:r>
+          </w:p>
+        </w:tc>
+      </w:tr>
+      <w:tr>
+        <w:tc>
+          <w:tcPr>
+            <w:tcW w:w="2276" w:type="dxa"/>
+            <w:tcBorders>
+              <w:top w:val="single" w:sz="1" w:space="0" w:color="BBBBBB"/>
+              <w:left w:val="single" w:sz="1" w:space="0" w:color="BBBBBB"/>
+              <w:bottom w:val="single" w:sz="1" w:space="0" w:color="BBBBBB"/>
+              <w:right w:val="single" w:sz="1" w:space="0" w:color="BBBBBB"/>
+            </w:tcBorders>
+            <w:shd w:val="clear" w:color="auto" w:fill="FFFFFF"/>
+            <w:tcMar>
+              <w:top w:w="80" w:type="dxa"/>
+              <w:left w:w="120" w:type="dxa"/>
+              <w:bottom w:w="80" w:type="dxa"/>
+              <w:right w:w="120" w:type="dxa"/>
+            </w:tcMar>
+            <w:vAlign w:val="center"/>
+          </w:tcPr>
+          <w:p>
+            <w:proofErr w:type="spellStart"/>
+            <w:r>
+              <w:rPr>
+                <w:sz w:val="20"/>
+                <w:szCs w:val="20"/>
+              </w:rPr>
+              <w:t>adult</w:t>
+            </w:r>
+            <w:proofErr w:type="spellEnd"/>
+          </w:p>
+        </w:tc>
+        <w:tc>
+          <w:tcPr>
+            <w:tcW w:w="1750" w:type="dxa"/>
+            <w:tcBorders>
+              <w:top w:val="single" w:sz="1" w:space="0" w:color="BBBBBB"/>
+              <w:left w:val="single" w:sz="1" w:space="0" w:color="BBBBBB"/>
+              <w:bottom w:val="single" w:sz="1" w:space="0" w:color="BBBBBB"/>
+              <w:right w:val="single" w:sz="1" w:space="0" w:color="BBBBBB"/>
+            </w:tcBorders>
+            <w:shd w:val="clear" w:color="auto" w:fill="FFFFFF"/>
+            <w:tcMar>
+              <w:top w:w="80" w:type="dxa"/>
+              <w:left w:w="120" w:type="dxa"/>
+              <w:bottom w:w="80" w:type="dxa"/>
+              <w:right w:w="120" w:type="dxa"/>
+            </w:tcMar>
+            <w:vAlign w:val="center"/>
+          </w:tcPr>
+          <w:p>
+            <w:r>
+              <w:rPr>
+                <w:sz w:val="20"/>
+                <w:szCs w:val="20"/>
+              </w:rPr>
+              <w:t>0.8328</w:t>
+            </w:r>
+          </w:p>
+        </w:tc>
+        <w:tc>
+          <w:tcPr>
+            <w:tcW w:w="1735" w:type="dxa"/>
+            <w:tcBorders>
+              <w:top w:val="single" w:sz="1" w:space="0" w:color="BBBBBB"/>
+              <w:left w:val="single" w:sz="1" w:space="0" w:color="BBBBBB"/>
+              <w:bottom w:val="single" w:sz="1" w:space="0" w:color="BBBBBB"/>
+              <w:right w:val="single" w:sz="1" w:space="0" w:color="BBBBBB"/>
+            </w:tcBorders>
+            <w:shd w:val="clear" w:color="auto" w:fill="FFFFFF"/>
+            <w:tcMar>
+              <w:top w:w="80" w:type="dxa"/>
+              <w:left w:w="120" w:type="dxa"/>
+              <w:bottom w:w="80" w:type="dxa"/>
+              <w:right w:w="120" w:type="dxa"/>
+            </w:tcMar>
+            <w:vAlign w:val="center"/>
+          </w:tcPr>
+          <w:p>
+            <w:r>
+              <w:rPr>
+                <w:sz w:val="20"/>
+                <w:szCs w:val="20"/>
+              </w:rPr>
+              <w:t>0.8065</w:t>
+            </w:r>
+          </w:p>
+        </w:tc>
+        <w:tc>
+          <w:tcPr>
+            <w:tcW w:w="1791" w:type="dxa"/>
+            <w:tcBorders>
+              <w:top w:val="single" w:sz="1" w:space="0" w:color="BBBBBB"/>
+              <w:left w:val="single" w:sz="1" w:space="0" w:color="BBBBBB"/>
+              <w:bottom w:val="single" w:sz="1" w:space="0" w:color="BBBBBB"/>
+              <w:right w:val="single" w:sz="1" w:space="0" w:color="BBBBBB"/>
+            </w:tcBorders>
+            <w:shd w:val="clear" w:color="auto" w:fill="FFFFFF"/>
+            <w:tcMar>
+              <w:top w:w="80" w:type="dxa"/>
+              <w:left w:w="120" w:type="dxa"/>
+              <w:bottom w:w="80" w:type="dxa"/>
+              <w:right w:w="120" w:type="dxa"/>
+            </w:tcMar>
+            <w:vAlign w:val="center"/>
+          </w:tcPr>
+          <w:p>
+            <w:proofErr w:type="spellStart"/>
+            <w:r>
+              <w:rPr>
+                <w:sz w:val="20"/>
+                <w:szCs w:val="20"/>
+              </w:rPr>
+              <w:t>simple_const</w:t>
+            </w:r>
+            <w:proofErr w:type="spellEnd"/>
+          </w:p>
+        </w:tc>
+        <w:tc>
+          <w:tcPr>
+            <w:tcW w:w="1472" w:type="dxa"/>
+            <w:tcBorders>
+              <w:top w:val="single" w:sz="1" w:space="0" w:color="BBBBBB"/>
+              <w:left w:val="single" w:sz="1" w:space="0" w:color="BBBBBB"/>
+              <w:bottom w:val="single" w:sz="1" w:space="0" w:color="BBBBBB"/>
+              <w:right w:val="single" w:sz="1" w:space="0" w:color="BBBBBB"/>
+            </w:tcBorders>
+            <w:shd w:val="clear" w:color="auto" w:fill="FFFFFF"/>
+          </w:tcPr>
+          <w:p>
+            <w:pPr>
+              <w:rPr>
+                <w:sz w:val="20"/>
+                <w:szCs w:val="20"/>
+              </w:rPr>
+            </w:pPr>
+            <w:r>
+              <w:rPr>
+                <w:sz w:val="20"/>
+                <w:szCs w:val="20"/>
+              </w:rPr>
+              <w:t>0.8222</w:t>
+            </w:r>
+          </w:p>
+        </w:tc>
+      </w:tr>
+      <w:tr>
+        <w:tc>
+          <w:tcPr>
+            <w:tcW w:w="2276" w:type="dxa"/>
+            <w:tcBorders>
+              <w:top w:val="single" w:sz="1" w:space="0" w:color="BBBBBB"/>
+              <w:left w:val="single" w:sz="1" w:space="0" w:color="BBBBBB"/>
+              <w:bottom w:val="single" w:sz="1" w:space="0" w:color="BBBBBB"/>
+              <w:right w:val="single" w:sz="1" w:space="0" w:color="BBBBBB"/>
+            </w:tcBorders>
+            <w:shd w:val="clear" w:color="auto" w:fill="FFFFFF"/>
+            <w:tcMar>
+              <w:top w:w="80" w:type="dxa"/>
+              <w:left w:w="120" w:type="dxa"/>
+              <w:bottom w:w="80" w:type="dxa"/>
+              <w:right w:w="120" w:type="dxa"/>
+            </w:tcMar>
+            <w:vAlign w:val="center"/>
+          </w:tcPr>
+          <w:p>
+            <w:proofErr w:type="spellStart"/>
+            <w:r>
+              <w:rPr>
+                <w:sz w:val="20"/>
+                <w:szCs w:val="20"/>
+              </w:rPr>
+              <w:t>bank_marketing</w:t>
+            </w:r>
+            <w:proofErr w:type="spellEnd"/>
+          </w:p>
+        </w:tc>
+        <w:tc>
+          <w:tcPr>
+            <w:tcW w:w="1750" w:type="dxa"/>
+            <w:tcBorders>
+              <w:top w:val="single" w:sz="1" w:space="0" w:color="BBBBBB"/>
+              <w:left w:val="single" w:sz="1" w:space="0" w:color="BBBBBB"/>
+              <w:bottom w:val="single" w:sz="1" w:space="0" w:color="BBBBBB"/>
+              <w:right w:val="single" w:sz="1" w:space="0" w:color="BBBBBB"/>
+            </w:tcBorders>
+            <w:shd w:val="clear" w:color="auto" w:fill="FFFFFF"/>
+            <w:tcMar>
+              <w:top w:w="80" w:type="dxa"/>
+              <w:left w:w="120" w:type="dxa"/>
+              <w:bottom w:w="80" w:type="dxa"/>
+              <w:right w:w="120" w:type="dxa"/>
+            </w:tcMar>
+            <w:vAlign w:val="center"/>
+          </w:tcPr>
+          <w:p>
+            <w:r>
+              <w:rPr>
+                <w:sz w:val="20"/>
+                <w:szCs w:val="20"/>
+              </w:rPr>
+              <w:t>0.8545</w:t>
+            </w:r>
+          </w:p>
+        </w:tc>
+        <w:tc>
+          <w:tcPr>
+            <w:tcW w:w="1735" w:type="dxa"/>
+            <w:tcBorders>
+              <w:top w:val="single" w:sz="1" w:space="0" w:color="BBBBBB"/>
+              <w:left w:val="single" w:sz="1" w:space="0" w:color="BBBBBB"/>
+              <w:bottom w:val="single" w:sz="1" w:space="0" w:color="BBBBBB"/>
+              <w:right w:val="single" w:sz="1" w:space="0" w:color="BBBBBB"/>
+            </w:tcBorders>
+            <w:shd w:val="clear" w:color="auto" w:fill="FFFFFF"/>
+            <w:tcMar>
+              <w:top w:w="80" w:type="dxa"/>
+              <w:left w:w="120" w:type="dxa"/>
+              <w:bottom w:w="80" w:type="dxa"/>
+              <w:right w:w="120" w:type="dxa"/>
+            </w:tcMar>
+            <w:vAlign w:val="center"/>
+          </w:tcPr>
+          <w:p>
+            <w:r>
+              <w:rPr>
+                <w:sz w:val="20"/>
+                <w:szCs w:val="20"/>
+              </w:rPr>
+              <w:t>0.8099</w:t>
+            </w:r>
+          </w:p>
+        </w:tc>
+        <w:tc>
+          <w:tcPr>
+            <w:tcW w:w="1791" w:type="dxa"/>
+            <w:tcBorders>
+              <w:top w:val="single" w:sz="1" w:space="0" w:color="BBBBBB"/>
+              <w:left w:val="single" w:sz="1" w:space="0" w:color="BBBBBB"/>
+              <w:bottom w:val="single" w:sz="1" w:space="0" w:color="BBBBBB"/>
+              <w:right w:val="single" w:sz="1" w:space="0" w:color="BBBBBB"/>
+            </w:tcBorders>
+            <w:shd w:val="clear" w:color="auto" w:fill="FFFFFF"/>
+            <w:tcMar>
+              <w:top w:w="80" w:type="dxa"/>
+              <w:left w:w="120" w:type="dxa"/>
+              <w:bottom w:w="80" w:type="dxa"/>
+              <w:right w:w="120" w:type="dxa"/>
+            </w:tcMar>
+            <w:vAlign w:val="center"/>
+          </w:tcPr>
+          <w:p>
+            <w:proofErr w:type="spellStart"/>
+            <w:r>
+              <w:rPr>
+                <w:sz w:val="20"/>
+                <w:szCs w:val="20"/>
+              </w:rPr>
+              <w:t>simple_mean</w:t>
+            </w:r>
+            <w:proofErr w:type="spellEnd"/>
+          </w:p>
+        </w:tc>
+        <w:tc>
+          <w:tcPr>
+            <w:tcW w:w="1472" w:type="dxa"/>
+            <w:tcBorders>
+              <w:top w:val="single" w:sz="1" w:space="0" w:color="BBBBBB"/>
+              <w:left w:val="single" w:sz="1" w:space="0" w:color="BBBBBB"/>
+              <w:bottom w:val="single" w:sz="1" w:space="0" w:color="BBBBBB"/>
+              <w:right w:val="single" w:sz="1" w:space="0" w:color="BBBBBB"/>
+            </w:tcBorders>
+            <w:shd w:val="clear" w:color="auto" w:fill="FFFFFF"/>
+          </w:tcPr>
+          <w:p>
+            <w:pPr>
+              <w:rPr>
+                <w:sz w:val="20"/>
+                <w:szCs w:val="20"/>
+              </w:rPr>
+            </w:pPr>
+            <w:r>
+              <w:rPr>
+                <w:sz w:val="20"/>
+                <w:szCs w:val="20"/>
+              </w:rPr>
+              <w:t>0.8479</w:t>
+            </w:r>
+          </w:p>
+        </w:tc>
+      </w:tr>
+      <w:tr>
+        <w:tc>
+          <w:tcPr>
+            <w:tcW w:w="2276" w:type="dxa"/>
+            <w:tcBorders>
+              <w:top w:val="single" w:sz="1" w:space="0" w:color="BBBBBB"/>
+              <w:left w:val="single" w:sz="1" w:space="0" w:color="BBBBBB"/>
+              <w:bottom w:val="single" w:sz="1" w:space="0" w:color="BBBBBB"/>
+              <w:right w:val="single" w:sz="1" w:space="0" w:color="BBBBBB"/>
+            </w:tcBorders>
+            <w:shd w:val="clear" w:color="auto" w:fill="FFFFFF"/>
+            <w:tcMar>
+              <w:top w:w="80" w:type="dxa"/>
+              <w:left w:w="120" w:type="dxa"/>
+              <w:bottom w:w="80" w:type="dxa"/>
+              <w:right w:w="120" w:type="dxa"/>
+            </w:tcMar>
+            <w:vAlign w:val="center"/>
+          </w:tcPr>
+          <w:p>
+            <w:pPr>
+              <w:rPr>
+                <w:sz w:val="20"/>
+                <w:szCs w:val="20"/>
+              </w:rPr>
+            </w:pPr>
+            <w:proofErr w:type="spellStart"/>
+            <w:r>
+              <w:rPr>
+                <w:sz w:val="20"/>
+                <w:szCs w:val="20"/>
+              </w:rPr>
+              <w:t>air_quality_uci</w:t>
+            </w:r>
+            <w:proofErr w:type="spellEnd"/>
+          </w:p>
+        </w:tc>
+        <w:tc>
+          <w:tcPr>
+            <w:tcW w:w="1750" w:type="dxa"/>
+            <w:tcBorders>
+              <w:top w:val="single" w:sz="1" w:space="0" w:color="BBBBBB"/>
+              <w:left w:val="single" w:sz="1" w:space="0" w:color="BBBBBB"/>
+              <w:bottom w:val="single" w:sz="1" w:space="0" w:color="BBBBBB"/>
+              <w:right w:val="single" w:sz="1" w:space="0" w:color="BBBBBB"/>
+            </w:tcBorders>
+            <w:shd w:val="clear" w:color="auto" w:fill="FFFFFF"/>
+            <w:tcMar>
+              <w:top w:w="80" w:type="dxa"/>
+              <w:left w:w="120" w:type="dxa"/>
+              <w:bottom w:w="80" w:type="dxa"/>
+              <w:right w:w="120" w:type="dxa"/>
+            </w:tcMar>
+            <w:vAlign w:val="center"/>
+          </w:tcPr>
+          <w:p>
+            <w:pPr>
+              <w:rPr>
+                <w:sz w:val="20"/>
+                <w:szCs w:val="20"/>
+              </w:rPr>
+            </w:pPr>
+            <w:r>
+              <w:rPr>
+                <w:sz w:val="20"/>
+                <w:szCs w:val="20"/>
+              </w:rPr>
+              <w:t>0.9960</w:t>
+            </w:r>
+          </w:p>
+        </w:tc>
+        <w:tc>
+          <w:tcPr>
+            <w:tcW w:w="1735" w:type="dxa"/>
+            <w:tcBorders>
+              <w:top w:val="single" w:sz="1" w:space="0" w:color="BBBBBB"/>
+              <w:left w:val="single" w:sz="1" w:space="0" w:color="BBBBBB"/>
+              <w:bottom w:val="single" w:sz="1" w:space="0" w:color="BBBBBB"/>
+              <w:right w:val="single" w:sz="1" w:space="0" w:color="BBBBBB"/>
+            </w:tcBorders>
+            <w:shd w:val="clear" w:color="auto" w:fill="FFFFFF"/>
+            <w:tcMar>
+              <w:top w:w="80" w:type="dxa"/>
+              <w:left w:w="120" w:type="dxa"/>
+              <w:bottom w:w="80" w:type="dxa"/>
+              <w:right w:w="120" w:type="dxa"/>
+            </w:tcMar>
+            <w:vAlign w:val="center"/>
+          </w:tcPr>
+          <w:p>
+            <w:pPr>
+              <w:rPr>
+                <w:sz w:val="20"/>
+                <w:szCs w:val="20"/>
+              </w:rPr>
+            </w:pPr>
+            <w:r>
+              <w:rPr>
+                <w:sz w:val="20"/>
+                <w:szCs w:val="20"/>
+              </w:rPr>
+              <w:t>-0.9002</w:t>
+            </w:r>
+          </w:p>
+        </w:tc>
+        <w:tc>
+          <w:tcPr>
+            <w:tcW w:w="1791" w:type="dxa"/>
+            <w:tcBorders>
+              <w:top w:val="single" w:sz="1" w:space="0" w:color="BBBBBB"/>
+              <w:left w:val="single" w:sz="1" w:space="0" w:color="BBBBBB"/>
+              <w:bottom w:val="single" w:sz="1" w:space="0" w:color="BBBBBB"/>
+              <w:right w:val="single" w:sz="1" w:space="0" w:color="BBBBBB"/>
+            </w:tcBorders>
+            <w:shd w:val="clear" w:color="auto" w:fill="FFFFFF"/>
+            <w:tcMar>
+              <w:top w:w="80" w:type="dxa"/>
+              <w:left w:w="120" w:type="dxa"/>
+              <w:bottom w:w="80" w:type="dxa"/>
+              <w:right w:w="120" w:type="dxa"/>
+            </w:tcMar>
+            <w:vAlign w:val="center"/>
+          </w:tcPr>
+          <w:p>
+            <w:pPr>
+              <w:rPr>
+                <w:sz w:val="20"/>
+                <w:szCs w:val="20"/>
+              </w:rPr>
+            </w:pPr>
+            <w:proofErr w:type="spellStart"/>
+            <w:r>
+              <w:rPr>
+                <w:sz w:val="20"/>
+                <w:szCs w:val="20"/>
+              </w:rPr>
+              <w:t>iterative</w:t>
+            </w:r>
+            <w:proofErr w:type="spellEnd"/>
+          </w:p>
+        </w:tc>
+        <w:tc>
+          <w:tcPr>
+            <w:tcW w:w="1472" w:type="dxa"/>
+            <w:tcBorders>
+              <w:top w:val="single" w:sz="1" w:space="0" w:color="BBBBBB"/>
+              <w:left w:val="single" w:sz="1" w:space="0" w:color="BBBBBB"/>
+              <w:bottom w:val="single" w:sz="1" w:space="0" w:color="BBBBBB"/>
+              <w:right w:val="single" w:sz="1" w:space="0" w:color="BBBBBB"/>
+            </w:tcBorders>
+            <w:shd w:val="clear" w:color="auto" w:fill="FFFFFF"/>
+          </w:tcPr>
+          <w:p>
+            <w:pPr>
+              <w:rPr>
+                <w:sz w:val="20"/>
+                <w:szCs w:val="20"/>
+              </w:rPr>
+            </w:pPr>
+            <w:r>
+              <w:rPr>
+                <w:sz w:val="20"/>
+                <w:szCs w:val="20"/>
+              </w:rPr>
+              <w:t>0.9908</w:t>
+            </w:r>
+          </w:p>
+        </w:tc>
+      </w:tr>
+      <w:tr>
+        <w:tc>
+          <w:tcPr>
+            <w:tcW w:w="2276" w:type="dxa"/>
+            <w:tcBorders>
+              <w:top w:val="single" w:sz="1" w:space="0" w:color="BBBBBB"/>
+              <w:left w:val="single" w:sz="1" w:space="0" w:color="BBBBBB"/>
+              <w:bottom w:val="single" w:sz="1" w:space="0" w:color="BBBBBB"/>
+              <w:right w:val="single" w:sz="1" w:space="0" w:color="BBBBBB"/>
+            </w:tcBorders>
+            <w:shd w:val="clear" w:color="auto" w:fill="FFFFFF"/>
+            <w:tcMar>
+              <w:top w:w="80" w:type="dxa"/>
+              <w:left w:w="120" w:type="dxa"/>
+              <w:bottom w:w="80" w:type="dxa"/>
+              <w:right w:w="120" w:type="dxa"/>
+            </w:tcMar>
+            <w:vAlign w:val="center"/>
+          </w:tcPr>
+          <w:p>
+            <w:pPr>
+              <w:rPr>
+                <w:sz w:val="20"/>
+                <w:szCs w:val="20"/>
+              </w:rPr>
+            </w:pPr>
+            <w:proofErr w:type="spellStart"/>
+            <w:r>
+              <w:rPr>
+                <w:sz w:val="20"/>
+                <w:szCs w:val="20"/>
+              </w:rPr>
+              <w:t>communities_crime</w:t>
+            </w:r>
+            <w:proofErr w:type="spellEnd"/>
+          </w:p>
+        </w:tc>
+        <w:tc>
+          <w:tcPr>
+            <w:tcW w:w="1750" w:type="dxa"/>
+            <w:tcBorders>
+              <w:top w:val="single" w:sz="1" w:space="0" w:color="BBBBBB"/>
+              <w:left w:val="single" w:sz="1" w:space="0" w:color="BBBBBB"/>
+              <w:bottom w:val="single" w:sz="1" w:space="0" w:color="BBBBBB"/>
+              <w:right w:val="single" w:sz="1" w:space="0" w:color="BBBBBB"/>
+            </w:tcBorders>
+            <w:shd w:val="clear" w:color="auto" w:fill="FFFFFF"/>
+            <w:tcMar>
+              <w:top w:w="80" w:type="dxa"/>
+              <w:left w:w="120" w:type="dxa"/>
+              <w:bottom w:w="80" w:type="dxa"/>
+              <w:right w:w="120" w:type="dxa"/>
+            </w:tcMar>
+            <w:vAlign w:val="center"/>
+          </w:tcPr>
+          <w:p>
+            <w:pPr>
+              <w:rPr>
+                <w:sz w:val="20"/>
+                <w:szCs w:val="20"/>
+              </w:rPr>
+            </w:pPr>
+            <w:r>
+              <w:rPr>
+                <w:sz w:val="20"/>
+                <w:szCs w:val="20"/>
+              </w:rPr>
+              <w:t>0.6280</w:t>
+            </w:r>
+          </w:p>
+        </w:tc>
+        <w:tc>
+          <w:tcPr>
+            <w:tcW w:w="1735" w:type="dxa"/>
+            <w:tcBorders>
+              <w:top w:val="single" w:sz="1" w:space="0" w:color="BBBBBB"/>
+              <w:left w:val="single" w:sz="1" w:space="0" w:color="BBBBBB"/>
+              <w:bottom w:val="single" w:sz="1" w:space="0" w:color="BBBBBB"/>
+              <w:right w:val="single" w:sz="1" w:space="0" w:color="BBBBBB"/>
+            </w:tcBorders>
+            <w:shd w:val="clear" w:color="auto" w:fill="FFFFFF"/>
+            <w:tcMar>
+              <w:top w:w="80" w:type="dxa"/>
+              <w:left w:w="120" w:type="dxa"/>
+              <w:bottom w:w="80" w:type="dxa"/>
+              <w:right w:w="120" w:type="dxa"/>
+            </w:tcMar>
+            <w:vAlign w:val="center"/>
+          </w:tcPr>
+          <w:p>
+            <w:pPr>
+              <w:rPr>
+                <w:sz w:val="20"/>
+                <w:szCs w:val="20"/>
+              </w:rPr>
+            </w:pPr>
+            <w:r>
+              <w:rPr>
+                <w:sz w:val="20"/>
+                <w:szCs w:val="20"/>
+              </w:rPr>
+              <w:t>0.5155</w:t>
+            </w:r>
+          </w:p>
+        </w:tc>
+        <w:tc>
+          <w:tcPr>
+            <w:tcW w:w="1791" w:type="dxa"/>
+            <w:tcBorders>
+              <w:top w:val="single" w:sz="1" w:space="0" w:color="BBBBBB"/>
+              <w:left w:val="single" w:sz="1" w:space="0" w:color="BBBBBB"/>
+              <w:bottom w:val="single" w:sz="1" w:space="0" w:color="BBBBBB"/>
+              <w:right w:val="single" w:sz="1" w:space="0" w:color="BBBBBB"/>
+            </w:tcBorders>
+            <w:shd w:val="clear" w:color="auto" w:fill="FFFFFF"/>
+            <w:tcMar>
+              <w:top w:w="80" w:type="dxa"/>
+              <w:left w:w="120" w:type="dxa"/>
+              <w:bottom w:w="80" w:type="dxa"/>
+              <w:right w:w="120" w:type="dxa"/>
+            </w:tcMar>
+            <w:vAlign w:val="center"/>
+          </w:tcPr>
+          <w:p>
+            <w:pPr>
+              <w:rPr>
+                <w:sz w:val="20"/>
+                <w:szCs w:val="20"/>
+              </w:rPr>
+            </w:pPr>
+            <w:proofErr w:type="spellStart"/>
+            <w:r>
+              <w:rPr>
+                <w:sz w:val="20"/>
+                <w:szCs w:val="20"/>
+              </w:rPr>
+              <w:t>iterative</w:t>
+            </w:r>
+            <w:proofErr w:type="spellEnd"/>
+          </w:p>
+        </w:tc>
+        <w:tc>
+          <w:tcPr>
+            <w:tcW w:w="1472" w:type="dxa"/>
+            <w:tcBorders>
+              <w:top w:val="single" w:sz="1" w:space="0" w:color="BBBBBB"/>
+              <w:left w:val="single" w:sz="1" w:space="0" w:color="BBBBBB"/>
+              <w:bottom w:val="single" w:sz="1" w:space="0" w:color="BBBBBB"/>
+              <w:right w:val="single" w:sz="1" w:space="0" w:color="BBBBBB"/>
+            </w:tcBorders>
+            <w:shd w:val="clear" w:color="auto" w:fill="FFFFFF"/>
+          </w:tcPr>
+          <w:p>
+            <w:pPr>
+              <w:rPr>
+                <w:sz w:val="20"/>
+                <w:szCs w:val="20"/>
+              </w:rPr>
+            </w:pPr>
+            <w:r>
+              <w:rPr>
+                <w:sz w:val="20"/>
+                <w:szCs w:val="20"/>
+              </w:rPr>
+              <w:t>0.6255</w:t>
+            </w:r>
+          </w:p>
+        </w:tc>
+      </w:tr>
+    </w:tbl>
+    <w:p>
+      <w:pPr>
+        <w:spacing w:before="80" w:after="160"/>
+      </w:pPr>
+      <w:r>
+        <w:rPr>
+          <w:i/>
+          <w:iCs/>
+          <w:sz w:val="18"/>
+          <w:szCs w:val="18"/>
+        </w:rPr>
+        <w:t xml:space="preserve">Tabela </w:t>
+      </w:r>
+      <w:r>
+        <w:rPr>
+          <w:i/>
+          <w:iCs/>
+          <w:sz w:val="18"/>
+          <w:szCs w:val="18"/>
+        </w:rPr>
+        <w:t>8</w:t>
+      </w:r>
+      <w:r>
+        <w:rPr>
+          <w:i/>
+          <w:iCs/>
+          <w:sz w:val="18"/>
+          <w:szCs w:val="18"/>
+        </w:rPr>
+        <w:t xml:space="preserve">: </w:t>
+      </w:r>
+      <w:r>
+        <w:rPr>
+          <w:i/>
+          <w:iCs/>
+          <w:sz w:val="18"/>
+          <w:szCs w:val="18"/>
+        </w:rPr>
+        <w:t xml:space="preserve">Comparação entre baseline, </w:t>
+      </w:r>
+      <w:proofErr w:type="spellStart"/>
+      <w:r>
+        <w:rPr>
+          <w:i/>
+          <w:iCs/>
+          <w:sz w:val="18"/>
+          <w:szCs w:val="18"/>
+        </w:rPr>
+        <w:t>dropna</w:t>
+      </w:r>
+      <w:proofErr w:type="spellEnd"/>
+      <w:r>
+        <w:rPr>
+          <w:i/>
+          <w:iCs/>
+          <w:sz w:val="18"/>
+          <w:szCs w:val="18"/>
+        </w:rPr>
+        <w:t xml:space="preserve"> e melhor imputador (</w:t>
+      </w:r>
+      <w:proofErr w:type="spellStart"/>
+      <w:r>
+        <w:rPr>
+          <w:i/>
+          <w:iCs/>
+          <w:sz w:val="18"/>
+          <w:szCs w:val="18"/>
+        </w:rPr>
+        <w:t>LightGBM</w:t>
+      </w:r>
+      <w:proofErr w:type="spellEnd"/>
+      <w:r>
+        <w:rPr>
+          <w:i/>
+          <w:iCs/>
+          <w:sz w:val="18"/>
+          <w:szCs w:val="18"/>
+        </w:rPr>
+        <w:t>).</w:t>
+      </w:r>
+    </w:p>
+    <w:p>
+      <w:pPr>
+        <w:spacing w:before="80" w:after="80"/>
+        <w:jc w:val="both"/>
+      </w:pPr>
+      <w:r>
+        <w:t xml:space="preserve">O </w:t>
+      </w:r>
+      <w:proofErr w:type="spellStart"/>
+      <w:r>
+        <w:t>dropna</w:t>
+      </w:r>
+      <w:proofErr w:type="spellEnd"/>
+      <w:r>
+        <w:t xml:space="preserve"> causou perdas significativas em todos os </w:t>
+      </w:r>
+      <w:proofErr w:type="spellStart"/>
+      <w:r>
+        <w:t>datasets</w:t>
+      </w:r>
+      <w:proofErr w:type="spellEnd"/>
+      <w:r>
+        <w:t xml:space="preserve">, especialmente no </w:t>
+      </w:r>
+      <w:proofErr w:type="spellStart"/>
+      <w:r>
+        <w:t>air_quality_uci</w:t>
+      </w:r>
+      <w:proofErr w:type="spellEnd"/>
+      <w:r>
+        <w:t xml:space="preserve"> onde o R² despencou de 0.996 para -0.900 — um colapso total. A imputação recuperou quase todo o desempenho perdido em todos os </w:t>
+      </w:r>
+      <w:proofErr w:type="spellStart"/>
+      <w:r>
+        <w:t>datasets</w:t>
+      </w:r>
+      <w:proofErr w:type="spellEnd"/>
+      <w:r>
+        <w:t xml:space="preserve">, </w:t>
+      </w:r>
+      <w:r>
+        <w:t>com</w:t>
+      </w:r>
+      <w:r>
+        <w:t xml:space="preserve"> o </w:t>
+      </w:r>
+      <w:proofErr w:type="spellStart"/>
+      <w:r>
+        <w:t>iterative</w:t>
+      </w:r>
+      <w:proofErr w:type="spellEnd"/>
+      <w:r>
+        <w:t xml:space="preserve"> sendo o melhor</w:t>
+      </w:r>
+      <w:r>
+        <w:t xml:space="preserve"> </w:t>
+      </w:r>
+      <w:r>
+        <w:t>em</w:t>
+      </w:r>
+      <w:r>
+        <w:t xml:space="preserve"> </w:t>
+      </w:r>
+      <w:r>
+        <w:t>regressão e</w:t>
+      </w:r>
+      <w:r>
+        <w:t xml:space="preserve"> </w:t>
+      </w:r>
+      <w:r>
+        <w:t xml:space="preserve">o </w:t>
+      </w:r>
+      <w:proofErr w:type="spellStart"/>
+      <w:r>
+        <w:t>simple_mean</w:t>
+      </w:r>
+      <w:proofErr w:type="spellEnd"/>
+      <w:r>
+        <w:t>/</w:t>
+      </w:r>
+      <w:proofErr w:type="spellStart"/>
+      <w:r>
+        <w:t>const</w:t>
+      </w:r>
+      <w:proofErr w:type="spellEnd"/>
+      <w:r>
+        <w:t xml:space="preserve"> em classificação.</w:t>
+      </w:r>
+      <w:r>
+        <w:br w:type="textWrapping" w:clear="all"/>
+      </w:r>
+    </w:p>
+    <w:p>
+      <w:pPr>
+        <w:spacing w:before="80" w:after="80"/>
+        <w:jc w:val="both"/>
+      </w:pPr>
+    </w:p>
+    <w:p>
+      <w:pPr>
+        <w:pStyle w:val="Ttulo2"/>
+      </w:pPr>
+      <w:r>
+        <w:t>5.</w:t>
+      </w:r>
+      <w:r>
+        <w:t>2</w:t>
+      </w:r>
+      <w:r>
+        <w:t xml:space="preserve"> Impacto do mecanismo de ausência</w:t>
       </w:r>
     </w:p>
     <w:p>
@@ -2967,6 +4021,7 @@
         <w:rPr>
           <w:noProof/>
         </w:rPr>
+        <w:lastRenderedPageBreak/>
         <w:drawing>
           <wp:inline distT="0" distB="0" distL="0" distR="0" wp14:anchorId="2F569C87" wp14:editId="28BFB379">
             <wp:extent cx="5700000" cy="4033970"/>
@@ -3076,27 +4131,7 @@
           <w:sz w:val="18"/>
           <w:szCs w:val="18"/>
         </w:rPr>
-        <w:t xml:space="preserve">, </w:t>
-      </w:r>
-      <w:proofErr w:type="gramStart"/>
-      <w:r>
-        <w:rPr>
-          <w:i/>
-          <w:iCs/>
-          <w:sz w:val="18"/>
-          <w:szCs w:val="18"/>
-        </w:rPr>
-        <w:t>media</w:t>
-      </w:r>
-      <w:proofErr w:type="gramEnd"/>
-      <w:r>
-        <w:rPr>
-          <w:i/>
-          <w:iCs/>
-          <w:sz w:val="18"/>
-          <w:szCs w:val="18"/>
-        </w:rPr>
-        <w:t xml:space="preserve"> dos imputadores).</w:t>
+        <w:t>, media dos imputadores).</w:t>
       </w:r>
     </w:p>
     <w:p>
@@ -3139,11 +4174,7 @@
         <w:t>ausência</w:t>
       </w:r>
       <w:r>
-        <w:t xml:space="preserve"> dos </w:t>
-      </w:r>
-      <w:r>
-        <w:lastRenderedPageBreak/>
-        <w:t xml:space="preserve">valores mais extremos distorce fundamentalmente a </w:t>
+        <w:t xml:space="preserve"> dos valores mais extremos distorce fundamentalmente a </w:t>
       </w:r>
       <w:r>
         <w:t>distribuição</w:t>
@@ -4341,6 +5372,7 @@
                 <w:sz w:val="20"/>
                 <w:szCs w:val="20"/>
               </w:rPr>
+              <w:lastRenderedPageBreak/>
               <w:t>30%</w:t>
             </w:r>
           </w:p>
@@ -4531,7 +5563,6 @@
         <w:rPr>
           <w:noProof/>
         </w:rPr>
-        <w:lastRenderedPageBreak/>
         <w:drawing>
           <wp:inline distT="0" distB="0" distL="0" distR="0" wp14:anchorId="5D54E6EC" wp14:editId="1D2BCDE5">
             <wp:extent cx="5700000" cy="4531001"/>
@@ -5193,6 +6224,7 @@
                 <w:sz w:val="20"/>
                 <w:szCs w:val="20"/>
               </w:rPr>
+              <w:lastRenderedPageBreak/>
               <w:t>simple_median</w:t>
             </w:r>
             <w:proofErr w:type="spellEnd"/>
@@ -5767,7 +6799,6 @@
                 <w:sz w:val="20"/>
                 <w:szCs w:val="20"/>
               </w:rPr>
-              <w:lastRenderedPageBreak/>
               <w:t>simple_const</w:t>
             </w:r>
             <w:proofErr w:type="spellEnd"/>
@@ -7073,27 +8104,7 @@
           <w:sz w:val="18"/>
           <w:szCs w:val="18"/>
         </w:rPr>
-        <w:t xml:space="preserve">, </w:t>
-      </w:r>
-      <w:proofErr w:type="gramStart"/>
-      <w:r>
-        <w:rPr>
-          <w:i/>
-          <w:iCs/>
-          <w:sz w:val="18"/>
-          <w:szCs w:val="18"/>
-        </w:rPr>
-        <w:t>media</w:t>
-      </w:r>
-      <w:proofErr w:type="gramEnd"/>
-      <w:r>
-        <w:rPr>
-          <w:i/>
-          <w:iCs/>
-          <w:sz w:val="18"/>
-          <w:szCs w:val="18"/>
-        </w:rPr>
-        <w:t xml:space="preserve"> por tarefa).</w:t>
+        <w:t>, media por tarefa).</w:t>
       </w:r>
     </w:p>
     <w:p>
@@ -7201,6 +8212,7 @@
         <w:t xml:space="preserve"> de linhas sob </w:t>
       </w:r>
       <w:r>
+        <w:lastRenderedPageBreak/>
         <w:t>ausência</w:t>
       </w:r>
       <w:r>
@@ -7236,7 +8248,6 @@
         <w:rPr>
           <w:noProof/>
         </w:rPr>
-        <w:lastRenderedPageBreak/>
         <w:drawing>
           <wp:inline distT="0" distB="0" distL="0" distR="0" wp14:anchorId="44A2B5FA" wp14:editId="312C22AB">
             <wp:extent cx="5700000" cy="4033970"/>
@@ -7433,11 +8444,7 @@
       </w:r>
       <w:proofErr w:type="spellEnd"/>
       <w:r>
-        <w:t xml:space="preserve">). </w:t>
-      </w:r>
-      <w:proofErr w:type="gramStart"/>
-      <w:r>
-        <w:t xml:space="preserve">O </w:t>
+        <w:t xml:space="preserve">). O </w:t>
       </w:r>
       <w:proofErr w:type="spellStart"/>
       <w:r>
@@ -7445,11 +8452,7 @@
       </w:r>
       <w:proofErr w:type="spellEnd"/>
       <w:r>
-        <w:t xml:space="preserve"> mantem-se</w:t>
-      </w:r>
-      <w:proofErr w:type="gramEnd"/>
-      <w:r>
-        <w:t xml:space="preserve"> </w:t>
+        <w:t xml:space="preserve"> mantem-se </w:t>
       </w:r>
       <w:r>
         <w:t>próximo</w:t>
@@ -8577,15 +9580,7 @@
       </w:r>
       <w:proofErr w:type="spellEnd"/>
       <w:r>
-        <w:t xml:space="preserve"> teve o pior MAE de imputação (18.560) </w:t>
-      </w:r>
-      <w:proofErr w:type="gramStart"/>
-      <w:r>
-        <w:t>e também</w:t>
-      </w:r>
-      <w:proofErr w:type="gramEnd"/>
-      <w:r>
-        <w:t xml:space="preserve"> o pior desempenho preditivo, mas por razões diferentes: o </w:t>
+        <w:t xml:space="preserve"> teve o pior MAE de imputação (18.560) e também o pior desempenho preditivo, mas por razões diferentes: o </w:t>
       </w:r>
       <w:proofErr w:type="spellStart"/>
       <w:r>
@@ -9841,7 +10836,6 @@
   <w:style w:type="character" w:default="1" w:styleId="Fontepargpadro">
     <w:name w:val="Default Paragraph Font"/>
     <w:uiPriority w:val="1"/>
-    <w:semiHidden/>
     <w:unhideWhenUsed/>
   </w:style>
   <w:style w:type="table" w:default="1" w:styleId="Tabelanormal">

</xml_diff>